<commit_message>
feat: implement facade service, add load testing script, and update documentation
</commit_message>
<xml_diff>
--- a/Lab1.docx
+++ b/Lab1.docx
@@ -4,29 +4,222 @@
   <w:body>
     <w:p>
       <w:pPr>
+        <w:jc w:val="center"/>
         <w:rPr>
-          <w:lang w:val="en-US"/>
+          <w:b/>
+          <w:bCs/>
         </w:rPr>
       </w:pPr>
       <w:r>
         <w:rPr>
-          <w:lang w:val="en-US"/>
+          <w:b/>
+          <w:bCs/>
         </w:rPr>
-        <w:t>1</w:t>
-      </w:r>
-    </w:p>
-    <w:p>
-      <w:pPr>
+        <w:t>П</w:t>
+      </w:r>
+      <w:r>
         <w:rPr>
-          <w:lang w:val="en-US"/>
+          <w:b/>
+          <w:bCs/>
         </w:rPr>
-      </w:pPr>
-      <w:r>
+        <w:t xml:space="preserve">ротокол </w:t>
+      </w:r>
+      <w:r>
+        <w:rPr>
+          <w:b/>
+          <w:bCs/>
+        </w:rPr>
+        <w:t>до лабораторної роботи №1</w:t>
+      </w:r>
+    </w:p>
+    <w:p>
+      <w:r>
+        <w:rPr>
+          <w:b/>
+          <w:bCs/>
+        </w:rPr>
+        <w:t>Тема:</w:t>
+      </w:r>
+      <w:r>
+        <w:t xml:space="preserve"> Базова архітектура мікросервісів</w:t>
+      </w:r>
+      <w:r>
+        <w:br/>
+      </w:r>
+      <w:r>
+        <w:rPr>
+          <w:b/>
+          <w:bCs/>
+        </w:rPr>
+        <w:t>Репозиторій проєкту:</w:t>
+      </w:r>
+      <w:r>
+        <w:t xml:space="preserve"> </w:t>
+      </w:r>
+      <w:hyperlink r:id="rId5" w:tgtFrame="_new" w:history="1">
+        <w:r>
+          <w:rPr>
+            <w:rStyle w:val="Hyperlink"/>
+          </w:rPr>
+          <w:t>https://github.com/KonigAngmar/ds-design-lab1</w:t>
+        </w:r>
+      </w:hyperlink>
+      <w:r>
+        <w:br/>
+      </w:r>
+      <w:r>
+        <w:rPr>
+          <w:b/>
+          <w:bCs/>
+        </w:rPr>
+        <w:t>Мета роботи:</w:t>
+      </w:r>
+      <w:r>
+        <w:t xml:space="preserve"> реалізувати частину банківської системи на основі трьох мікросервісів, що взаємодіють через HTTP, перевірити коректність їх роботи та дослідити продуктивність системи у двох сценаріях навантаження. </w:t>
+      </w:r>
+    </w:p>
+    <w:p>
+      <w:pPr>
+        <w:rPr>
+          <w:b/>
+          <w:bCs/>
+        </w:rPr>
+      </w:pPr>
+      <w:r>
+        <w:rPr>
+          <w:b/>
+          <w:bCs/>
+        </w:rPr>
+        <w:t>1. Короткий опис реалізації</w:t>
+      </w:r>
+    </w:p>
+    <w:p>
+      <w:r>
+        <w:t>У роботі реалізовано три окремі мікросервіси:</w:t>
+      </w:r>
+    </w:p>
+    <w:p>
+      <w:pPr>
+        <w:numPr>
+          <w:ilvl w:val="0"/>
+          <w:numId w:val="1"/>
+        </w:numPr>
+      </w:pPr>
+      <w:r>
+        <w:rPr>
+          <w:b/>
+          <w:bCs/>
+        </w:rPr>
+        <w:t>facade-service</w:t>
+      </w:r>
+      <w:r>
+        <w:t xml:space="preserve"> — приймає POST/GET-запити від клієнта; </w:t>
+      </w:r>
+    </w:p>
+    <w:p>
+      <w:pPr>
+        <w:numPr>
+          <w:ilvl w:val="0"/>
+          <w:numId w:val="1"/>
+        </w:numPr>
+      </w:pPr>
+      <w:r>
+        <w:rPr>
+          <w:b/>
+          <w:bCs/>
+        </w:rPr>
+        <w:t>logging-service</w:t>
+      </w:r>
+      <w:r>
+        <w:t xml:space="preserve"> — зберігає всі транзакції в оперативній пам’яті; </w:t>
+      </w:r>
+    </w:p>
+    <w:p>
+      <w:pPr>
+        <w:numPr>
+          <w:ilvl w:val="0"/>
+          <w:numId w:val="1"/>
+        </w:numPr>
+      </w:pPr>
+      <w:r>
+        <w:rPr>
+          <w:b/>
+          <w:bCs/>
+        </w:rPr>
+        <w:t>counter-service</w:t>
+      </w:r>
+      <w:r>
+        <w:t xml:space="preserve"> — підраховує баланс кожного користувача та повертає поточний стан рахунків. </w:t>
+      </w:r>
+    </w:p>
+    <w:p>
+      <w:r>
+        <w:t>Після отримання POST-запиту facade-service генерує transaction_id, додає часову позначку та пересилає транзакцію одночасно до logging-service і counter-service. Після отримання відповідей сервіс повертає клієнту результат у вигляді ідентифікатора транзакції та оновленого балансу.</w:t>
+      </w:r>
+    </w:p>
+    <w:p>
+      <w:r>
+        <w:t>GET-запити підтримують два основні режими роботи:</w:t>
+      </w:r>
+    </w:p>
+    <w:p>
+      <w:pPr>
+        <w:numPr>
+          <w:ilvl w:val="0"/>
+          <w:numId w:val="2"/>
+        </w:numPr>
+      </w:pPr>
+      <w:r>
+        <w:t xml:space="preserve">GET /user/{user_id} — повертає баланс вибраного користувача та список його транзакцій; </w:t>
+      </w:r>
+    </w:p>
+    <w:p>
+      <w:pPr>
+        <w:numPr>
+          <w:ilvl w:val="0"/>
+          <w:numId w:val="2"/>
+        </w:numPr>
+      </w:pPr>
+      <w:r>
+        <w:t xml:space="preserve">GET /accounts — повертає баланси всіх користувачів. </w:t>
+      </w:r>
+    </w:p>
+    <w:p>
+      <w:r>
+        <w:t xml:space="preserve">Також у facade-service реалізовано вимірювання часу викликів до logging-service та counter-service, що дозволяє аналізувати внесок кожного підсервісу у загальну затримку системи. </w:t>
+      </w:r>
+    </w:p>
+    <w:p>
+      <w:pPr>
+        <w:rPr>
+          <w:b/>
+          <w:bCs/>
+        </w:rPr>
+      </w:pPr>
+      <w:r>
+        <w:rPr>
+          <w:b/>
+          <w:bCs/>
+        </w:rPr>
+        <w:t>2. Демонстрація коректності роботи системи</w:t>
+      </w:r>
+    </w:p>
+    <w:p>
+      <w:r>
+        <w:t>Для перевірки функціональності було виконано кілька POST-запитів для різних користувачів із операціями поповнення та списання коштів. Після цього за допомогою GET-запитів було перевірено правильність балансів користувачів і наявність збережених транзакцій.</w:t>
+      </w:r>
+    </w:p>
+    <w:p>
+      <w:r>
+        <w:rPr>
+          <w:noProof/>
+        </w:rPr>
+        <w:lastRenderedPageBreak/>
         <w:drawing>
-          <wp:inline distT="0" distB="0" distL="0" distR="0" wp14:anchorId="370DE22C" wp14:editId="1A952AB0">
+          <wp:inline distT="0" distB="0" distL="0" distR="0" wp14:anchorId="1C10647A" wp14:editId="372AE8D1">
             <wp:extent cx="5943600" cy="1150620"/>
             <wp:effectExtent l="0" t="0" r="0" b="0"/>
-            <wp:docPr id="727994508" name="Picture 1" descr="A computer screen with text on it&#10;&#10;Description automatically generated"/>
+            <wp:docPr id="1875013830" name="Picture 1" descr="A computer screen with text on it&#10;&#10;Description automatically generated"/>
             <wp:cNvGraphicFramePr>
               <a:graphicFrameLocks xmlns:a="http://schemas.openxmlformats.org/drawingml/2006/main" noChangeAspect="1"/>
             </wp:cNvGraphicFramePr>
@@ -38,7 +231,7 @@
                     <pic:cNvPicPr/>
                   </pic:nvPicPr>
                   <pic:blipFill>
-                    <a:blip r:embed="rId4"/>
+                    <a:blip r:embed="rId6"/>
                     <a:stretch>
                       <a:fillRect/>
                     </a:stretch>
@@ -58,35 +251,72 @@
           </wp:inline>
         </w:drawing>
       </w:r>
-    </w:p>
-    <w:p>
-      <w:pPr>
+      <w:r>
         <w:rPr>
-          <w:lang w:val="en-US"/>
+          <w:i/>
+          <w:iCs/>
         </w:rPr>
-      </w:pPr>
-      <w:r>
+        <w:t>Рисунок 1 – Демонстрація POST/GET-запитів та перевірка балансів користувачів.</w:t>
+      </w:r>
+    </w:p>
+    <w:p>
+      <w:r>
+        <w:t>Отже, базова функціональність системи працює коректно: транзакції приймаються, логуються, зміни балансу застосовуються правильно, а результати через GET-запити відповідають очікуваним значенням.</w:t>
+      </w:r>
+    </w:p>
+    <w:p>
+      <w:pPr>
         <w:rPr>
-          <w:lang w:val="en-US"/>
+          <w:b/>
+          <w:bCs/>
         </w:rPr>
-        <w:t>2</w:t>
-      </w:r>
-    </w:p>
-    <w:p>
-      <w:pPr>
+      </w:pPr>
+      <w:r>
         <w:rPr>
-          <w:lang w:val="en-US"/>
+          <w:b/>
+          <w:bCs/>
         </w:rPr>
-      </w:pPr>
+        <w:t>3. Навантажувальне тестування</w:t>
+      </w:r>
+    </w:p>
+    <w:p>
+      <w:r>
+        <w:t>Для оцінювання продуктивності системи було реалізовано клієнт, який виконує задану кількість HTTP-запитів до facade-service та вимірює загальний час виконання. Дослідження проводилося у двох сценаріях:</w:t>
+      </w:r>
+    </w:p>
+    <w:p>
+      <w:pPr>
+        <w:numPr>
+          <w:ilvl w:val="0"/>
+          <w:numId w:val="4"/>
+        </w:numPr>
+      </w:pPr>
+      <w:r>
+        <w:t xml:space="preserve">10 клієнтів, кожен виконує 10 000 транзакцій на власний рахунок. </w:t>
+      </w:r>
+    </w:p>
+    <w:p>
+      <w:pPr>
+        <w:numPr>
+          <w:ilvl w:val="0"/>
+          <w:numId w:val="4"/>
+        </w:numPr>
+      </w:pPr>
+      <w:r>
+        <w:t xml:space="preserve">10 клієнтів, кожен виконує 10 000 транзакцій на один спільний рахунок. </w:t>
+      </w:r>
+    </w:p>
+    <w:p>
       <w:r>
         <w:rPr>
+          <w:noProof/>
           <w:lang w:val="en-US"/>
         </w:rPr>
         <w:drawing>
-          <wp:inline distT="0" distB="0" distL="0" distR="0" wp14:anchorId="7B1DD9B3" wp14:editId="225E63FD">
+          <wp:inline distT="0" distB="0" distL="0" distR="0" wp14:anchorId="27F7055C" wp14:editId="7ECDFC53">
             <wp:extent cx="5943600" cy="3225800"/>
             <wp:effectExtent l="0" t="0" r="0" b="0"/>
-            <wp:docPr id="383024334" name="Picture 1" descr="A screenshot of a computer program&#10;&#10;Description automatically generated"/>
+            <wp:docPr id="1178034969" name="Picture 1" descr="A screenshot of a computer program&#10;&#10;Description automatically generated"/>
             <wp:cNvGraphicFramePr>
               <a:graphicFrameLocks xmlns:a="http://schemas.openxmlformats.org/drawingml/2006/main" noChangeAspect="1"/>
             </wp:cNvGraphicFramePr>
@@ -98,7 +328,7 @@
                     <pic:cNvPicPr/>
                   </pic:nvPicPr>
                   <pic:blipFill>
-                    <a:blip r:embed="rId5"/>
+                    <a:blip r:embed="rId7"/>
                     <a:stretch>
                       <a:fillRect/>
                     </a:stretch>
@@ -118,47 +348,233 @@
           </wp:inline>
         </w:drawing>
       </w:r>
-    </w:p>
-    <w:p>
-      <w:pPr>
+      <w:r>
         <w:rPr>
-          <w:lang w:val="ru-RU"/>
+          <w:i/>
+          <w:iCs/>
         </w:rPr>
-      </w:pPr>
-      <w:r>
+        <w:t>Рисунок 2 – Результати навантажувального тестування для двох сценаріїв.</w:t>
+      </w:r>
+    </w:p>
+    <w:p>
+      <w:r>
+        <w:t>За результатами тестування отримано такі показники:</w:t>
+      </w:r>
+    </w:p>
+    <w:p>
+      <w:r>
+        <w:t>Сценарій 1: 10 клієнтів, у кожного свій рахунок</w:t>
+      </w:r>
+    </w:p>
+    <w:p>
+      <w:pPr>
+        <w:numPr>
+          <w:ilvl w:val="0"/>
+          <w:numId w:val="5"/>
+        </w:numPr>
+      </w:pPr>
+      <w:r>
+        <w:lastRenderedPageBreak/>
+        <w:t xml:space="preserve">Загальна кількість запитів: 100000 </w:t>
+      </w:r>
+    </w:p>
+    <w:p>
+      <w:pPr>
+        <w:numPr>
+          <w:ilvl w:val="0"/>
+          <w:numId w:val="5"/>
+        </w:numPr>
+      </w:pPr>
+      <w:r>
+        <w:t xml:space="preserve">Загальний час: 429.555 с </w:t>
+      </w:r>
+    </w:p>
+    <w:p>
+      <w:pPr>
+        <w:numPr>
+          <w:ilvl w:val="0"/>
+          <w:numId w:val="5"/>
+        </w:numPr>
+      </w:pPr>
+      <w:r>
+        <w:t xml:space="preserve">Продуктивність: 232.80 RPS </w:t>
+      </w:r>
+    </w:p>
+    <w:p>
+      <w:pPr>
+        <w:numPr>
+          <w:ilvl w:val="0"/>
+          <w:numId w:val="5"/>
+        </w:numPr>
+      </w:pPr>
+      <w:r>
+        <w:t xml:space="preserve">Середній внесок logging-service: 2.024 ms/req </w:t>
+      </w:r>
+    </w:p>
+    <w:p>
+      <w:pPr>
+        <w:numPr>
+          <w:ilvl w:val="0"/>
+          <w:numId w:val="5"/>
+        </w:numPr>
+      </w:pPr>
+      <w:r>
+        <w:t xml:space="preserve">Середній внесок counter-service: 1.781 ms/req </w:t>
+      </w:r>
+    </w:p>
+    <w:p>
+      <w:pPr>
+        <w:numPr>
+          <w:ilvl w:val="0"/>
+          <w:numId w:val="5"/>
+        </w:numPr>
+      </w:pPr>
+      <w:r>
+        <w:t xml:space="preserve">Верифікація: успішно </w:t>
+      </w:r>
+    </w:p>
+    <w:p>
+      <w:r>
+        <w:t>Сценарій 2: 10 клієнтів, один спільний рахунок</w:t>
+      </w:r>
+    </w:p>
+    <w:p>
+      <w:pPr>
+        <w:numPr>
+          <w:ilvl w:val="0"/>
+          <w:numId w:val="6"/>
+        </w:numPr>
+      </w:pPr>
+      <w:r>
+        <w:t xml:space="preserve">Загальна кількість запитів: 100000 </w:t>
+      </w:r>
+    </w:p>
+    <w:p>
+      <w:pPr>
+        <w:numPr>
+          <w:ilvl w:val="0"/>
+          <w:numId w:val="6"/>
+        </w:numPr>
+      </w:pPr>
+      <w:r>
+        <w:t xml:space="preserve">Загальний час: 431.134 с </w:t>
+      </w:r>
+    </w:p>
+    <w:p>
+      <w:pPr>
+        <w:numPr>
+          <w:ilvl w:val="0"/>
+          <w:numId w:val="6"/>
+        </w:numPr>
+      </w:pPr>
+      <w:r>
+        <w:t xml:space="preserve">Продуктивність: 231.95 RPS </w:t>
+      </w:r>
+    </w:p>
+    <w:p>
+      <w:pPr>
+        <w:numPr>
+          <w:ilvl w:val="0"/>
+          <w:numId w:val="6"/>
+        </w:numPr>
+      </w:pPr>
+      <w:r>
+        <w:t xml:space="preserve">Середній внесок logging-service: 2.028 ms/req </w:t>
+      </w:r>
+    </w:p>
+    <w:p>
+      <w:pPr>
+        <w:numPr>
+          <w:ilvl w:val="0"/>
+          <w:numId w:val="6"/>
+        </w:numPr>
+      </w:pPr>
+      <w:r>
+        <w:t xml:space="preserve">Середній внесок counter-service: 1.781 ms/req </w:t>
+      </w:r>
+    </w:p>
+    <w:p>
+      <w:pPr>
+        <w:numPr>
+          <w:ilvl w:val="0"/>
+          <w:numId w:val="6"/>
+        </w:numPr>
+      </w:pPr>
+      <w:r>
+        <w:t xml:space="preserve">Баланс спільного рахунку: 100000 </w:t>
+      </w:r>
+    </w:p>
+    <w:p>
+      <w:pPr>
+        <w:numPr>
+          <w:ilvl w:val="0"/>
+          <w:numId w:val="6"/>
+        </w:numPr>
+      </w:pPr>
+      <w:r>
+        <w:t xml:space="preserve">Верифікація: успішно </w:t>
+      </w:r>
+    </w:p>
+    <w:p>
+      <w:pPr>
         <w:rPr>
-          <w:lang w:val="en-US"/>
+          <w:b/>
+          <w:bCs/>
         </w:rPr>
-        <w:t>3</w:t>
-      </w:r>
-    </w:p>
-    <w:p>
-      <w:r>
-        <w:t>За результатами навантажувального тестування обидва сценарії показали майже однакову продуктивність. У сценарії 1 (10 клієнтів, у кожного свій рахунок) виконано 100000 запитів за 429.555 с, що дає 232.80 RPS. У сценарії 2 (10 клієнтів, один спільний рахунок) також виконано 100000 запитів за 431.134 с, тобто 231.95 RPS. Різниця між сценаріями дуже мала (менше 1%), тому можна зробити висновок, що використання спільного рахунку не створило помітного “вузького місця” через конкуренцію за ресурс.</w:t>
-      </w:r>
-    </w:p>
-    <w:p>
-      <w:r>
-        <w:t>Середній час викликів із facade-service до підсервісів стабільний у двох сценаріях: для logging-service приблизно 2.02 ms/запит, для counter-service приблизно 1.78 ms/запит. Оскільки facade викликає logging і counter паралельно, загальний внесок зовнішніх викликів визначається переважно більшим із цих двох значень, тобто близько 2 ms.</w:t>
+      </w:pPr>
+      <w:r>
+        <w:rPr>
+          <w:b/>
+          <w:bCs/>
+        </w:rPr>
+        <w:t>4. Аналіз результатів</w:t>
+      </w:r>
+    </w:p>
+    <w:p>
+      <w:r>
+        <w:t>За результатами навантажувального тестування обидва сценарії показали майже однакову продуктивність. У першому сценарії система обробила 100000 запитів за 429.555 секунд, що відповідає 232.80 RPS. У другому сценарії система обробила ту саму кількість запитів за 431.134 секунд, тобто 231.95 RPS. Різниця між сценаріями є дуже незначною — менше 1%.</w:t>
+      </w:r>
+    </w:p>
+    <w:p>
+      <w:r>
+        <w:t>Середній час викликів із facade-service до підсервісів також майже не змінився. Для logging-service він становив близько 2.02 ms на запит, а для counter-service — близько 1.78 ms на запит. Оскільки facade-service викликає обидва сервіси паралельно, загальний вплив віддалених викликів визначається переважно більшим значенням, тобто приблизно 2 ms.</w:t>
+      </w:r>
+    </w:p>
+    <w:p>
+      <w:r>
+        <w:t xml:space="preserve">Також результати показали коректність роботи системи під навантаженням. У першому сценарії всі 10 рахунків отримали баланс 10000, а в другому сценарії спільний рахунок отримав баланс 100000. Це означає, що втрати транзакцій або порушення узгодженості даних не спостерігались. </w:t>
+      </w:r>
+    </w:p>
+    <w:p>
+      <w:pPr>
+        <w:rPr>
+          <w:b/>
+          <w:bCs/>
+        </w:rPr>
+      </w:pPr>
+      <w:r>
+        <w:rPr>
+          <w:b/>
+          <w:bCs/>
+        </w:rPr>
+        <w:t>5. Висновок</w:t>
       </w:r>
     </w:p>
     <w:p>
       <w:r>
         <w:lastRenderedPageBreak/>
-        <w:t>Також видно, що система коректно обробляє навантаження: у сценарії 1 усі 10 рахунків отримали баланс 10000, а у сценарії 2 спільний рахунок отримав баланс 100000, тобто втрат транзакцій або проблем із узгодженістю не виявлено.</w:t>
-      </w:r>
-    </w:p>
-    <w:p>
-      <w:r>
-        <w:t>Отже, продуктивність системи в межах цього тесту є стабільною, а основні обмеження швидкодії, ймовірно, пов’язані не з логікою оновлення балансу одного користувача, а з загальним overhead (обробка HTTP-запитів у facade, робота контейнерів/мережі, планування потоків/воркерів тощо).</w:t>
-      </w:r>
-    </w:p>
-    <w:p>
-      <w:pPr>
-        <w:rPr>
-          <w:lang w:val="en-US"/>
-        </w:rPr>
-      </w:pPr>
+        <w:t>У ході виконання лабораторної роботи було реалізовано базову архітектуру мікросервісної системи з трьох сервісів: facade-service, logging-service та counter-service. Було перевірено коректність обробки транзакцій, логування повідомлень і розрахунку балансів користувачів.</w:t>
+      </w:r>
+    </w:p>
+    <w:p>
+      <w:r>
+        <w:t>Результати тестування показали, що система стабільно працює як у випадку окремих рахунків для кожного клієнта, так і у випадку спільного рахунку. Використання одного спільного рахунку не створило помітного вузького місця. Основні обмеження швидкодії, ймовірно, пов’язані не з логікою оновлення балансу, а із загальним накладним часом на HTTP-виклики, мережеву взаємодію контейнерів і планування виконання потоків.</w:t>
+      </w:r>
+    </w:p>
+    <w:p>
+      <w:r>
+        <w:t>Отже, поставлена мета роботи досягнута: систему реалізовано, її коректність підтверджено, а продуктивність досліджено та проаналізовано.</w:t>
+      </w:r>
     </w:p>
     <w:sectPr>
       <w:pgSz w:w="12240" w:h="15840"/>
@@ -168,6 +584,887 @@
     </w:sectPr>
   </w:body>
 </w:document>
+</file>
+
+<file path=word/numbering.xml><?xml version="1.0" encoding="utf-8"?>
+<w:numbering xmlns:wpc="http://schemas.microsoft.com/office/word/2010/wordprocessingCanvas" xmlns:cx="http://schemas.microsoft.com/office/drawing/2014/chartex" xmlns:cx1="http://schemas.microsoft.com/office/drawing/2015/9/8/chartex" xmlns:cx2="http://schemas.microsoft.com/office/drawing/2015/10/21/chartex" xmlns:cx3="http://schemas.microsoft.com/office/drawing/2016/5/9/chartex" xmlns:cx4="http://schemas.microsoft.com/office/drawing/2016/5/10/chartex" xmlns:cx5="http://schemas.microsoft.com/office/drawing/2016/5/11/chartex" xmlns:cx6="http://schemas.microsoft.com/office/drawing/2016/5/12/chartex" xmlns:cx7="http://schemas.microsoft.com/office/drawing/2016/5/13/chartex" xmlns:cx8="http://schemas.microsoft.com/office/drawing/2016/5/14/chartex" xmlns:mc="http://schemas.openxmlformats.org/markup-compatibility/2006" xmlns:aink="http://schemas.microsoft.com/office/drawing/2016/ink" xmlns:am3d="http://schemas.microsoft.com/office/drawing/2017/model3d" xmlns:o="urn:schemas-microsoft-com:office:office" xmlns:oel="http://schemas.microsoft.com/office/2019/extlst" xmlns:r="http://schemas.openxmlformats.org/officeDocument/2006/relationships" xmlns:m="http://schemas.openxmlformats.org/officeDocument/2006/math" xmlns:v="urn:schemas-microsoft-com:vml" xmlns:wp14="http://schemas.microsoft.com/office/word/2010/wordprocessingDrawing" xmlns:wp="http://schemas.openxmlformats.org/drawingml/2006/wordprocessingDrawing" xmlns:w10="urn:schemas-microsoft-com:office:word" xmlns:w="http://schemas.openxmlformats.org/wordprocessingml/2006/main" xmlns:w14="http://schemas.microsoft.com/office/word/2010/wordml" xmlns:w15="http://schemas.microsoft.com/office/word/2012/wordml" xmlns:w16cex="http://schemas.microsoft.com/office/word/2018/wordml/cex" xmlns:w16cid="http://schemas.microsoft.com/office/word/2016/wordml/cid" xmlns:w16="http://schemas.microsoft.com/office/word/2018/wordml" xmlns:w16du="http://schemas.microsoft.com/office/word/2023/wordml/word16du" xmlns:w16sdtdh="http://schemas.microsoft.com/office/word/2020/wordml/sdtdatahash" xmlns:w16se="http://schemas.microsoft.com/office/word/2015/wordml/symex" xmlns:wpg="http://schemas.microsoft.com/office/word/2010/wordprocessingGroup" xmlns:wpi="http://schemas.microsoft.com/office/word/2010/wordprocessingInk" xmlns:wne="http://schemas.microsoft.com/office/word/2006/wordml" xmlns:wps="http://schemas.microsoft.com/office/word/2010/wordprocessingShape" mc:Ignorable="w14 w15 w16se w16cid w16 w16cex w16sdtdh w16du wp14">
+  <w:abstractNum w:abstractNumId="0" w15:restartNumberingAfterBreak="0">
+    <w:nsid w:val="0BD235EB"/>
+    <w:multiLevelType w:val="multilevel"/>
+    <w:tmpl w:val="796ECE8A"/>
+    <w:lvl w:ilvl="0">
+      <w:start w:val="1"/>
+      <w:numFmt w:val="bullet"/>
+      <w:lvlText w:val=""/>
+      <w:lvlJc w:val="left"/>
+      <w:pPr>
+        <w:tabs>
+          <w:tab w:val="num" w:pos="720"/>
+        </w:tabs>
+        <w:ind w:left="720" w:hanging="360"/>
+      </w:pPr>
+      <w:rPr>
+        <w:rFonts w:ascii="Symbol" w:hAnsi="Symbol" w:hint="default"/>
+        <w:sz w:val="20"/>
+      </w:rPr>
+    </w:lvl>
+    <w:lvl w:ilvl="1" w:tentative="1">
+      <w:start w:val="1"/>
+      <w:numFmt w:val="bullet"/>
+      <w:lvlText w:val="o"/>
+      <w:lvlJc w:val="left"/>
+      <w:pPr>
+        <w:tabs>
+          <w:tab w:val="num" w:pos="1440"/>
+        </w:tabs>
+        <w:ind w:left="1440" w:hanging="360"/>
+      </w:pPr>
+      <w:rPr>
+        <w:rFonts w:ascii="Courier New" w:hAnsi="Courier New" w:hint="default"/>
+        <w:sz w:val="20"/>
+      </w:rPr>
+    </w:lvl>
+    <w:lvl w:ilvl="2" w:tentative="1">
+      <w:start w:val="1"/>
+      <w:numFmt w:val="bullet"/>
+      <w:lvlText w:val=""/>
+      <w:lvlJc w:val="left"/>
+      <w:pPr>
+        <w:tabs>
+          <w:tab w:val="num" w:pos="2160"/>
+        </w:tabs>
+        <w:ind w:left="2160" w:hanging="360"/>
+      </w:pPr>
+      <w:rPr>
+        <w:rFonts w:ascii="Wingdings" w:hAnsi="Wingdings" w:hint="default"/>
+        <w:sz w:val="20"/>
+      </w:rPr>
+    </w:lvl>
+    <w:lvl w:ilvl="3" w:tentative="1">
+      <w:start w:val="1"/>
+      <w:numFmt w:val="bullet"/>
+      <w:lvlText w:val=""/>
+      <w:lvlJc w:val="left"/>
+      <w:pPr>
+        <w:tabs>
+          <w:tab w:val="num" w:pos="2880"/>
+        </w:tabs>
+        <w:ind w:left="2880" w:hanging="360"/>
+      </w:pPr>
+      <w:rPr>
+        <w:rFonts w:ascii="Wingdings" w:hAnsi="Wingdings" w:hint="default"/>
+        <w:sz w:val="20"/>
+      </w:rPr>
+    </w:lvl>
+    <w:lvl w:ilvl="4" w:tentative="1">
+      <w:start w:val="1"/>
+      <w:numFmt w:val="bullet"/>
+      <w:lvlText w:val=""/>
+      <w:lvlJc w:val="left"/>
+      <w:pPr>
+        <w:tabs>
+          <w:tab w:val="num" w:pos="3600"/>
+        </w:tabs>
+        <w:ind w:left="3600" w:hanging="360"/>
+      </w:pPr>
+      <w:rPr>
+        <w:rFonts w:ascii="Wingdings" w:hAnsi="Wingdings" w:hint="default"/>
+        <w:sz w:val="20"/>
+      </w:rPr>
+    </w:lvl>
+    <w:lvl w:ilvl="5" w:tentative="1">
+      <w:start w:val="1"/>
+      <w:numFmt w:val="bullet"/>
+      <w:lvlText w:val=""/>
+      <w:lvlJc w:val="left"/>
+      <w:pPr>
+        <w:tabs>
+          <w:tab w:val="num" w:pos="4320"/>
+        </w:tabs>
+        <w:ind w:left="4320" w:hanging="360"/>
+      </w:pPr>
+      <w:rPr>
+        <w:rFonts w:ascii="Wingdings" w:hAnsi="Wingdings" w:hint="default"/>
+        <w:sz w:val="20"/>
+      </w:rPr>
+    </w:lvl>
+    <w:lvl w:ilvl="6" w:tentative="1">
+      <w:start w:val="1"/>
+      <w:numFmt w:val="bullet"/>
+      <w:lvlText w:val=""/>
+      <w:lvlJc w:val="left"/>
+      <w:pPr>
+        <w:tabs>
+          <w:tab w:val="num" w:pos="5040"/>
+        </w:tabs>
+        <w:ind w:left="5040" w:hanging="360"/>
+      </w:pPr>
+      <w:rPr>
+        <w:rFonts w:ascii="Wingdings" w:hAnsi="Wingdings" w:hint="default"/>
+        <w:sz w:val="20"/>
+      </w:rPr>
+    </w:lvl>
+    <w:lvl w:ilvl="7" w:tentative="1">
+      <w:start w:val="1"/>
+      <w:numFmt w:val="bullet"/>
+      <w:lvlText w:val=""/>
+      <w:lvlJc w:val="left"/>
+      <w:pPr>
+        <w:tabs>
+          <w:tab w:val="num" w:pos="5760"/>
+        </w:tabs>
+        <w:ind w:left="5760" w:hanging="360"/>
+      </w:pPr>
+      <w:rPr>
+        <w:rFonts w:ascii="Wingdings" w:hAnsi="Wingdings" w:hint="default"/>
+        <w:sz w:val="20"/>
+      </w:rPr>
+    </w:lvl>
+    <w:lvl w:ilvl="8" w:tentative="1">
+      <w:start w:val="1"/>
+      <w:numFmt w:val="bullet"/>
+      <w:lvlText w:val=""/>
+      <w:lvlJc w:val="left"/>
+      <w:pPr>
+        <w:tabs>
+          <w:tab w:val="num" w:pos="6480"/>
+        </w:tabs>
+        <w:ind w:left="6480" w:hanging="360"/>
+      </w:pPr>
+      <w:rPr>
+        <w:rFonts w:ascii="Wingdings" w:hAnsi="Wingdings" w:hint="default"/>
+        <w:sz w:val="20"/>
+      </w:rPr>
+    </w:lvl>
+  </w:abstractNum>
+  <w:abstractNum w:abstractNumId="1" w15:restartNumberingAfterBreak="0">
+    <w:nsid w:val="0D6A5BF3"/>
+    <w:multiLevelType w:val="multilevel"/>
+    <w:tmpl w:val="6E2E4FD8"/>
+    <w:lvl w:ilvl="0">
+      <w:start w:val="1"/>
+      <w:numFmt w:val="bullet"/>
+      <w:lvlText w:val=""/>
+      <w:lvlJc w:val="left"/>
+      <w:pPr>
+        <w:tabs>
+          <w:tab w:val="num" w:pos="720"/>
+        </w:tabs>
+        <w:ind w:left="720" w:hanging="360"/>
+      </w:pPr>
+      <w:rPr>
+        <w:rFonts w:ascii="Symbol" w:hAnsi="Symbol" w:hint="default"/>
+        <w:sz w:val="20"/>
+      </w:rPr>
+    </w:lvl>
+    <w:lvl w:ilvl="1" w:tentative="1">
+      <w:start w:val="1"/>
+      <w:numFmt w:val="bullet"/>
+      <w:lvlText w:val="o"/>
+      <w:lvlJc w:val="left"/>
+      <w:pPr>
+        <w:tabs>
+          <w:tab w:val="num" w:pos="1440"/>
+        </w:tabs>
+        <w:ind w:left="1440" w:hanging="360"/>
+      </w:pPr>
+      <w:rPr>
+        <w:rFonts w:ascii="Courier New" w:hAnsi="Courier New" w:hint="default"/>
+        <w:sz w:val="20"/>
+      </w:rPr>
+    </w:lvl>
+    <w:lvl w:ilvl="2" w:tentative="1">
+      <w:start w:val="1"/>
+      <w:numFmt w:val="bullet"/>
+      <w:lvlText w:val=""/>
+      <w:lvlJc w:val="left"/>
+      <w:pPr>
+        <w:tabs>
+          <w:tab w:val="num" w:pos="2160"/>
+        </w:tabs>
+        <w:ind w:left="2160" w:hanging="360"/>
+      </w:pPr>
+      <w:rPr>
+        <w:rFonts w:ascii="Wingdings" w:hAnsi="Wingdings" w:hint="default"/>
+        <w:sz w:val="20"/>
+      </w:rPr>
+    </w:lvl>
+    <w:lvl w:ilvl="3" w:tentative="1">
+      <w:start w:val="1"/>
+      <w:numFmt w:val="bullet"/>
+      <w:lvlText w:val=""/>
+      <w:lvlJc w:val="left"/>
+      <w:pPr>
+        <w:tabs>
+          <w:tab w:val="num" w:pos="2880"/>
+        </w:tabs>
+        <w:ind w:left="2880" w:hanging="360"/>
+      </w:pPr>
+      <w:rPr>
+        <w:rFonts w:ascii="Wingdings" w:hAnsi="Wingdings" w:hint="default"/>
+        <w:sz w:val="20"/>
+      </w:rPr>
+    </w:lvl>
+    <w:lvl w:ilvl="4" w:tentative="1">
+      <w:start w:val="1"/>
+      <w:numFmt w:val="bullet"/>
+      <w:lvlText w:val=""/>
+      <w:lvlJc w:val="left"/>
+      <w:pPr>
+        <w:tabs>
+          <w:tab w:val="num" w:pos="3600"/>
+        </w:tabs>
+        <w:ind w:left="3600" w:hanging="360"/>
+      </w:pPr>
+      <w:rPr>
+        <w:rFonts w:ascii="Wingdings" w:hAnsi="Wingdings" w:hint="default"/>
+        <w:sz w:val="20"/>
+      </w:rPr>
+    </w:lvl>
+    <w:lvl w:ilvl="5" w:tentative="1">
+      <w:start w:val="1"/>
+      <w:numFmt w:val="bullet"/>
+      <w:lvlText w:val=""/>
+      <w:lvlJc w:val="left"/>
+      <w:pPr>
+        <w:tabs>
+          <w:tab w:val="num" w:pos="4320"/>
+        </w:tabs>
+        <w:ind w:left="4320" w:hanging="360"/>
+      </w:pPr>
+      <w:rPr>
+        <w:rFonts w:ascii="Wingdings" w:hAnsi="Wingdings" w:hint="default"/>
+        <w:sz w:val="20"/>
+      </w:rPr>
+    </w:lvl>
+    <w:lvl w:ilvl="6" w:tentative="1">
+      <w:start w:val="1"/>
+      <w:numFmt w:val="bullet"/>
+      <w:lvlText w:val=""/>
+      <w:lvlJc w:val="left"/>
+      <w:pPr>
+        <w:tabs>
+          <w:tab w:val="num" w:pos="5040"/>
+        </w:tabs>
+        <w:ind w:left="5040" w:hanging="360"/>
+      </w:pPr>
+      <w:rPr>
+        <w:rFonts w:ascii="Wingdings" w:hAnsi="Wingdings" w:hint="default"/>
+        <w:sz w:val="20"/>
+      </w:rPr>
+    </w:lvl>
+    <w:lvl w:ilvl="7" w:tentative="1">
+      <w:start w:val="1"/>
+      <w:numFmt w:val="bullet"/>
+      <w:lvlText w:val=""/>
+      <w:lvlJc w:val="left"/>
+      <w:pPr>
+        <w:tabs>
+          <w:tab w:val="num" w:pos="5760"/>
+        </w:tabs>
+        <w:ind w:left="5760" w:hanging="360"/>
+      </w:pPr>
+      <w:rPr>
+        <w:rFonts w:ascii="Wingdings" w:hAnsi="Wingdings" w:hint="default"/>
+        <w:sz w:val="20"/>
+      </w:rPr>
+    </w:lvl>
+    <w:lvl w:ilvl="8" w:tentative="1">
+      <w:start w:val="1"/>
+      <w:numFmt w:val="bullet"/>
+      <w:lvlText w:val=""/>
+      <w:lvlJc w:val="left"/>
+      <w:pPr>
+        <w:tabs>
+          <w:tab w:val="num" w:pos="6480"/>
+        </w:tabs>
+        <w:ind w:left="6480" w:hanging="360"/>
+      </w:pPr>
+      <w:rPr>
+        <w:rFonts w:ascii="Wingdings" w:hAnsi="Wingdings" w:hint="default"/>
+        <w:sz w:val="20"/>
+      </w:rPr>
+    </w:lvl>
+  </w:abstractNum>
+  <w:abstractNum w:abstractNumId="2" w15:restartNumberingAfterBreak="0">
+    <w:nsid w:val="26681EDB"/>
+    <w:multiLevelType w:val="multilevel"/>
+    <w:tmpl w:val="E8BC27C8"/>
+    <w:lvl w:ilvl="0">
+      <w:start w:val="1"/>
+      <w:numFmt w:val="bullet"/>
+      <w:lvlText w:val=""/>
+      <w:lvlJc w:val="left"/>
+      <w:pPr>
+        <w:tabs>
+          <w:tab w:val="num" w:pos="720"/>
+        </w:tabs>
+        <w:ind w:left="720" w:hanging="360"/>
+      </w:pPr>
+      <w:rPr>
+        <w:rFonts w:ascii="Symbol" w:hAnsi="Symbol" w:hint="default"/>
+        <w:sz w:val="20"/>
+      </w:rPr>
+    </w:lvl>
+    <w:lvl w:ilvl="1" w:tentative="1">
+      <w:start w:val="1"/>
+      <w:numFmt w:val="bullet"/>
+      <w:lvlText w:val="o"/>
+      <w:lvlJc w:val="left"/>
+      <w:pPr>
+        <w:tabs>
+          <w:tab w:val="num" w:pos="1440"/>
+        </w:tabs>
+        <w:ind w:left="1440" w:hanging="360"/>
+      </w:pPr>
+      <w:rPr>
+        <w:rFonts w:ascii="Courier New" w:hAnsi="Courier New" w:hint="default"/>
+        <w:sz w:val="20"/>
+      </w:rPr>
+    </w:lvl>
+    <w:lvl w:ilvl="2" w:tentative="1">
+      <w:start w:val="1"/>
+      <w:numFmt w:val="bullet"/>
+      <w:lvlText w:val=""/>
+      <w:lvlJc w:val="left"/>
+      <w:pPr>
+        <w:tabs>
+          <w:tab w:val="num" w:pos="2160"/>
+        </w:tabs>
+        <w:ind w:left="2160" w:hanging="360"/>
+      </w:pPr>
+      <w:rPr>
+        <w:rFonts w:ascii="Wingdings" w:hAnsi="Wingdings" w:hint="default"/>
+        <w:sz w:val="20"/>
+      </w:rPr>
+    </w:lvl>
+    <w:lvl w:ilvl="3" w:tentative="1">
+      <w:start w:val="1"/>
+      <w:numFmt w:val="bullet"/>
+      <w:lvlText w:val=""/>
+      <w:lvlJc w:val="left"/>
+      <w:pPr>
+        <w:tabs>
+          <w:tab w:val="num" w:pos="2880"/>
+        </w:tabs>
+        <w:ind w:left="2880" w:hanging="360"/>
+      </w:pPr>
+      <w:rPr>
+        <w:rFonts w:ascii="Wingdings" w:hAnsi="Wingdings" w:hint="default"/>
+        <w:sz w:val="20"/>
+      </w:rPr>
+    </w:lvl>
+    <w:lvl w:ilvl="4" w:tentative="1">
+      <w:start w:val="1"/>
+      <w:numFmt w:val="bullet"/>
+      <w:lvlText w:val=""/>
+      <w:lvlJc w:val="left"/>
+      <w:pPr>
+        <w:tabs>
+          <w:tab w:val="num" w:pos="3600"/>
+        </w:tabs>
+        <w:ind w:left="3600" w:hanging="360"/>
+      </w:pPr>
+      <w:rPr>
+        <w:rFonts w:ascii="Wingdings" w:hAnsi="Wingdings" w:hint="default"/>
+        <w:sz w:val="20"/>
+      </w:rPr>
+    </w:lvl>
+    <w:lvl w:ilvl="5" w:tentative="1">
+      <w:start w:val="1"/>
+      <w:numFmt w:val="bullet"/>
+      <w:lvlText w:val=""/>
+      <w:lvlJc w:val="left"/>
+      <w:pPr>
+        <w:tabs>
+          <w:tab w:val="num" w:pos="4320"/>
+        </w:tabs>
+        <w:ind w:left="4320" w:hanging="360"/>
+      </w:pPr>
+      <w:rPr>
+        <w:rFonts w:ascii="Wingdings" w:hAnsi="Wingdings" w:hint="default"/>
+        <w:sz w:val="20"/>
+      </w:rPr>
+    </w:lvl>
+    <w:lvl w:ilvl="6" w:tentative="1">
+      <w:start w:val="1"/>
+      <w:numFmt w:val="bullet"/>
+      <w:lvlText w:val=""/>
+      <w:lvlJc w:val="left"/>
+      <w:pPr>
+        <w:tabs>
+          <w:tab w:val="num" w:pos="5040"/>
+        </w:tabs>
+        <w:ind w:left="5040" w:hanging="360"/>
+      </w:pPr>
+      <w:rPr>
+        <w:rFonts w:ascii="Wingdings" w:hAnsi="Wingdings" w:hint="default"/>
+        <w:sz w:val="20"/>
+      </w:rPr>
+    </w:lvl>
+    <w:lvl w:ilvl="7" w:tentative="1">
+      <w:start w:val="1"/>
+      <w:numFmt w:val="bullet"/>
+      <w:lvlText w:val=""/>
+      <w:lvlJc w:val="left"/>
+      <w:pPr>
+        <w:tabs>
+          <w:tab w:val="num" w:pos="5760"/>
+        </w:tabs>
+        <w:ind w:left="5760" w:hanging="360"/>
+      </w:pPr>
+      <w:rPr>
+        <w:rFonts w:ascii="Wingdings" w:hAnsi="Wingdings" w:hint="default"/>
+        <w:sz w:val="20"/>
+      </w:rPr>
+    </w:lvl>
+    <w:lvl w:ilvl="8" w:tentative="1">
+      <w:start w:val="1"/>
+      <w:numFmt w:val="bullet"/>
+      <w:lvlText w:val=""/>
+      <w:lvlJc w:val="left"/>
+      <w:pPr>
+        <w:tabs>
+          <w:tab w:val="num" w:pos="6480"/>
+        </w:tabs>
+        <w:ind w:left="6480" w:hanging="360"/>
+      </w:pPr>
+      <w:rPr>
+        <w:rFonts w:ascii="Wingdings" w:hAnsi="Wingdings" w:hint="default"/>
+        <w:sz w:val="20"/>
+      </w:rPr>
+    </w:lvl>
+  </w:abstractNum>
+  <w:abstractNum w:abstractNumId="3" w15:restartNumberingAfterBreak="0">
+    <w:nsid w:val="541B58B4"/>
+    <w:multiLevelType w:val="multilevel"/>
+    <w:tmpl w:val="4EBAB80A"/>
+    <w:lvl w:ilvl="0">
+      <w:start w:val="1"/>
+      <w:numFmt w:val="bullet"/>
+      <w:lvlText w:val=""/>
+      <w:lvlJc w:val="left"/>
+      <w:pPr>
+        <w:tabs>
+          <w:tab w:val="num" w:pos="720"/>
+        </w:tabs>
+        <w:ind w:left="720" w:hanging="360"/>
+      </w:pPr>
+      <w:rPr>
+        <w:rFonts w:ascii="Symbol" w:hAnsi="Symbol" w:hint="default"/>
+        <w:sz w:val="20"/>
+      </w:rPr>
+    </w:lvl>
+    <w:lvl w:ilvl="1" w:tentative="1">
+      <w:start w:val="1"/>
+      <w:numFmt w:val="bullet"/>
+      <w:lvlText w:val="o"/>
+      <w:lvlJc w:val="left"/>
+      <w:pPr>
+        <w:tabs>
+          <w:tab w:val="num" w:pos="1440"/>
+        </w:tabs>
+        <w:ind w:left="1440" w:hanging="360"/>
+      </w:pPr>
+      <w:rPr>
+        <w:rFonts w:ascii="Courier New" w:hAnsi="Courier New" w:hint="default"/>
+        <w:sz w:val="20"/>
+      </w:rPr>
+    </w:lvl>
+    <w:lvl w:ilvl="2" w:tentative="1">
+      <w:start w:val="1"/>
+      <w:numFmt w:val="bullet"/>
+      <w:lvlText w:val=""/>
+      <w:lvlJc w:val="left"/>
+      <w:pPr>
+        <w:tabs>
+          <w:tab w:val="num" w:pos="2160"/>
+        </w:tabs>
+        <w:ind w:left="2160" w:hanging="360"/>
+      </w:pPr>
+      <w:rPr>
+        <w:rFonts w:ascii="Wingdings" w:hAnsi="Wingdings" w:hint="default"/>
+        <w:sz w:val="20"/>
+      </w:rPr>
+    </w:lvl>
+    <w:lvl w:ilvl="3" w:tentative="1">
+      <w:start w:val="1"/>
+      <w:numFmt w:val="bullet"/>
+      <w:lvlText w:val=""/>
+      <w:lvlJc w:val="left"/>
+      <w:pPr>
+        <w:tabs>
+          <w:tab w:val="num" w:pos="2880"/>
+        </w:tabs>
+        <w:ind w:left="2880" w:hanging="360"/>
+      </w:pPr>
+      <w:rPr>
+        <w:rFonts w:ascii="Wingdings" w:hAnsi="Wingdings" w:hint="default"/>
+        <w:sz w:val="20"/>
+      </w:rPr>
+    </w:lvl>
+    <w:lvl w:ilvl="4" w:tentative="1">
+      <w:start w:val="1"/>
+      <w:numFmt w:val="bullet"/>
+      <w:lvlText w:val=""/>
+      <w:lvlJc w:val="left"/>
+      <w:pPr>
+        <w:tabs>
+          <w:tab w:val="num" w:pos="3600"/>
+        </w:tabs>
+        <w:ind w:left="3600" w:hanging="360"/>
+      </w:pPr>
+      <w:rPr>
+        <w:rFonts w:ascii="Wingdings" w:hAnsi="Wingdings" w:hint="default"/>
+        <w:sz w:val="20"/>
+      </w:rPr>
+    </w:lvl>
+    <w:lvl w:ilvl="5" w:tentative="1">
+      <w:start w:val="1"/>
+      <w:numFmt w:val="bullet"/>
+      <w:lvlText w:val=""/>
+      <w:lvlJc w:val="left"/>
+      <w:pPr>
+        <w:tabs>
+          <w:tab w:val="num" w:pos="4320"/>
+        </w:tabs>
+        <w:ind w:left="4320" w:hanging="360"/>
+      </w:pPr>
+      <w:rPr>
+        <w:rFonts w:ascii="Wingdings" w:hAnsi="Wingdings" w:hint="default"/>
+        <w:sz w:val="20"/>
+      </w:rPr>
+    </w:lvl>
+    <w:lvl w:ilvl="6" w:tentative="1">
+      <w:start w:val="1"/>
+      <w:numFmt w:val="bullet"/>
+      <w:lvlText w:val=""/>
+      <w:lvlJc w:val="left"/>
+      <w:pPr>
+        <w:tabs>
+          <w:tab w:val="num" w:pos="5040"/>
+        </w:tabs>
+        <w:ind w:left="5040" w:hanging="360"/>
+      </w:pPr>
+      <w:rPr>
+        <w:rFonts w:ascii="Wingdings" w:hAnsi="Wingdings" w:hint="default"/>
+        <w:sz w:val="20"/>
+      </w:rPr>
+    </w:lvl>
+    <w:lvl w:ilvl="7" w:tentative="1">
+      <w:start w:val="1"/>
+      <w:numFmt w:val="bullet"/>
+      <w:lvlText w:val=""/>
+      <w:lvlJc w:val="left"/>
+      <w:pPr>
+        <w:tabs>
+          <w:tab w:val="num" w:pos="5760"/>
+        </w:tabs>
+        <w:ind w:left="5760" w:hanging="360"/>
+      </w:pPr>
+      <w:rPr>
+        <w:rFonts w:ascii="Wingdings" w:hAnsi="Wingdings" w:hint="default"/>
+        <w:sz w:val="20"/>
+      </w:rPr>
+    </w:lvl>
+    <w:lvl w:ilvl="8" w:tentative="1">
+      <w:start w:val="1"/>
+      <w:numFmt w:val="bullet"/>
+      <w:lvlText w:val=""/>
+      <w:lvlJc w:val="left"/>
+      <w:pPr>
+        <w:tabs>
+          <w:tab w:val="num" w:pos="6480"/>
+        </w:tabs>
+        <w:ind w:left="6480" w:hanging="360"/>
+      </w:pPr>
+      <w:rPr>
+        <w:rFonts w:ascii="Wingdings" w:hAnsi="Wingdings" w:hint="default"/>
+        <w:sz w:val="20"/>
+      </w:rPr>
+    </w:lvl>
+  </w:abstractNum>
+  <w:abstractNum w:abstractNumId="4" w15:restartNumberingAfterBreak="0">
+    <w:nsid w:val="551F5406"/>
+    <w:multiLevelType w:val="multilevel"/>
+    <w:tmpl w:val="6D9447CE"/>
+    <w:lvl w:ilvl="0">
+      <w:start w:val="1"/>
+      <w:numFmt w:val="decimal"/>
+      <w:lvlText w:val="%1."/>
+      <w:lvlJc w:val="left"/>
+      <w:pPr>
+        <w:tabs>
+          <w:tab w:val="num" w:pos="720"/>
+        </w:tabs>
+        <w:ind w:left="720" w:hanging="360"/>
+      </w:pPr>
+    </w:lvl>
+    <w:lvl w:ilvl="1" w:tentative="1">
+      <w:start w:val="1"/>
+      <w:numFmt w:val="decimal"/>
+      <w:lvlText w:val="%2."/>
+      <w:lvlJc w:val="left"/>
+      <w:pPr>
+        <w:tabs>
+          <w:tab w:val="num" w:pos="1440"/>
+        </w:tabs>
+        <w:ind w:left="1440" w:hanging="360"/>
+      </w:pPr>
+    </w:lvl>
+    <w:lvl w:ilvl="2" w:tentative="1">
+      <w:start w:val="1"/>
+      <w:numFmt w:val="decimal"/>
+      <w:lvlText w:val="%3."/>
+      <w:lvlJc w:val="left"/>
+      <w:pPr>
+        <w:tabs>
+          <w:tab w:val="num" w:pos="2160"/>
+        </w:tabs>
+        <w:ind w:left="2160" w:hanging="360"/>
+      </w:pPr>
+    </w:lvl>
+    <w:lvl w:ilvl="3" w:tentative="1">
+      <w:start w:val="1"/>
+      <w:numFmt w:val="decimal"/>
+      <w:lvlText w:val="%4."/>
+      <w:lvlJc w:val="left"/>
+      <w:pPr>
+        <w:tabs>
+          <w:tab w:val="num" w:pos="2880"/>
+        </w:tabs>
+        <w:ind w:left="2880" w:hanging="360"/>
+      </w:pPr>
+    </w:lvl>
+    <w:lvl w:ilvl="4" w:tentative="1">
+      <w:start w:val="1"/>
+      <w:numFmt w:val="decimal"/>
+      <w:lvlText w:val="%5."/>
+      <w:lvlJc w:val="left"/>
+      <w:pPr>
+        <w:tabs>
+          <w:tab w:val="num" w:pos="3600"/>
+        </w:tabs>
+        <w:ind w:left="3600" w:hanging="360"/>
+      </w:pPr>
+    </w:lvl>
+    <w:lvl w:ilvl="5" w:tentative="1">
+      <w:start w:val="1"/>
+      <w:numFmt w:val="decimal"/>
+      <w:lvlText w:val="%6."/>
+      <w:lvlJc w:val="left"/>
+      <w:pPr>
+        <w:tabs>
+          <w:tab w:val="num" w:pos="4320"/>
+        </w:tabs>
+        <w:ind w:left="4320" w:hanging="360"/>
+      </w:pPr>
+    </w:lvl>
+    <w:lvl w:ilvl="6" w:tentative="1">
+      <w:start w:val="1"/>
+      <w:numFmt w:val="decimal"/>
+      <w:lvlText w:val="%7."/>
+      <w:lvlJc w:val="left"/>
+      <w:pPr>
+        <w:tabs>
+          <w:tab w:val="num" w:pos="5040"/>
+        </w:tabs>
+        <w:ind w:left="5040" w:hanging="360"/>
+      </w:pPr>
+    </w:lvl>
+    <w:lvl w:ilvl="7" w:tentative="1">
+      <w:start w:val="1"/>
+      <w:numFmt w:val="decimal"/>
+      <w:lvlText w:val="%8."/>
+      <w:lvlJc w:val="left"/>
+      <w:pPr>
+        <w:tabs>
+          <w:tab w:val="num" w:pos="5760"/>
+        </w:tabs>
+        <w:ind w:left="5760" w:hanging="360"/>
+      </w:pPr>
+    </w:lvl>
+    <w:lvl w:ilvl="8" w:tentative="1">
+      <w:start w:val="1"/>
+      <w:numFmt w:val="decimal"/>
+      <w:lvlText w:val="%9."/>
+      <w:lvlJc w:val="left"/>
+      <w:pPr>
+        <w:tabs>
+          <w:tab w:val="num" w:pos="6480"/>
+        </w:tabs>
+        <w:ind w:left="6480" w:hanging="360"/>
+      </w:pPr>
+    </w:lvl>
+  </w:abstractNum>
+  <w:abstractNum w:abstractNumId="5" w15:restartNumberingAfterBreak="0">
+    <w:nsid w:val="706D6596"/>
+    <w:multiLevelType w:val="multilevel"/>
+    <w:tmpl w:val="D92E35AE"/>
+    <w:lvl w:ilvl="0">
+      <w:start w:val="1"/>
+      <w:numFmt w:val="bullet"/>
+      <w:lvlText w:val=""/>
+      <w:lvlJc w:val="left"/>
+      <w:pPr>
+        <w:tabs>
+          <w:tab w:val="num" w:pos="720"/>
+        </w:tabs>
+        <w:ind w:left="720" w:hanging="360"/>
+      </w:pPr>
+      <w:rPr>
+        <w:rFonts w:ascii="Symbol" w:hAnsi="Symbol" w:hint="default"/>
+        <w:sz w:val="20"/>
+      </w:rPr>
+    </w:lvl>
+    <w:lvl w:ilvl="1" w:tentative="1">
+      <w:start w:val="1"/>
+      <w:numFmt w:val="bullet"/>
+      <w:lvlText w:val="o"/>
+      <w:lvlJc w:val="left"/>
+      <w:pPr>
+        <w:tabs>
+          <w:tab w:val="num" w:pos="1440"/>
+        </w:tabs>
+        <w:ind w:left="1440" w:hanging="360"/>
+      </w:pPr>
+      <w:rPr>
+        <w:rFonts w:ascii="Courier New" w:hAnsi="Courier New" w:hint="default"/>
+        <w:sz w:val="20"/>
+      </w:rPr>
+    </w:lvl>
+    <w:lvl w:ilvl="2" w:tentative="1">
+      <w:start w:val="1"/>
+      <w:numFmt w:val="bullet"/>
+      <w:lvlText w:val=""/>
+      <w:lvlJc w:val="left"/>
+      <w:pPr>
+        <w:tabs>
+          <w:tab w:val="num" w:pos="2160"/>
+        </w:tabs>
+        <w:ind w:left="2160" w:hanging="360"/>
+      </w:pPr>
+      <w:rPr>
+        <w:rFonts w:ascii="Wingdings" w:hAnsi="Wingdings" w:hint="default"/>
+        <w:sz w:val="20"/>
+      </w:rPr>
+    </w:lvl>
+    <w:lvl w:ilvl="3" w:tentative="1">
+      <w:start w:val="1"/>
+      <w:numFmt w:val="bullet"/>
+      <w:lvlText w:val=""/>
+      <w:lvlJc w:val="left"/>
+      <w:pPr>
+        <w:tabs>
+          <w:tab w:val="num" w:pos="2880"/>
+        </w:tabs>
+        <w:ind w:left="2880" w:hanging="360"/>
+      </w:pPr>
+      <w:rPr>
+        <w:rFonts w:ascii="Wingdings" w:hAnsi="Wingdings" w:hint="default"/>
+        <w:sz w:val="20"/>
+      </w:rPr>
+    </w:lvl>
+    <w:lvl w:ilvl="4" w:tentative="1">
+      <w:start w:val="1"/>
+      <w:numFmt w:val="bullet"/>
+      <w:lvlText w:val=""/>
+      <w:lvlJc w:val="left"/>
+      <w:pPr>
+        <w:tabs>
+          <w:tab w:val="num" w:pos="3600"/>
+        </w:tabs>
+        <w:ind w:left="3600" w:hanging="360"/>
+      </w:pPr>
+      <w:rPr>
+        <w:rFonts w:ascii="Wingdings" w:hAnsi="Wingdings" w:hint="default"/>
+        <w:sz w:val="20"/>
+      </w:rPr>
+    </w:lvl>
+    <w:lvl w:ilvl="5" w:tentative="1">
+      <w:start w:val="1"/>
+      <w:numFmt w:val="bullet"/>
+      <w:lvlText w:val=""/>
+      <w:lvlJc w:val="left"/>
+      <w:pPr>
+        <w:tabs>
+          <w:tab w:val="num" w:pos="4320"/>
+        </w:tabs>
+        <w:ind w:left="4320" w:hanging="360"/>
+      </w:pPr>
+      <w:rPr>
+        <w:rFonts w:ascii="Wingdings" w:hAnsi="Wingdings" w:hint="default"/>
+        <w:sz w:val="20"/>
+      </w:rPr>
+    </w:lvl>
+    <w:lvl w:ilvl="6" w:tentative="1">
+      <w:start w:val="1"/>
+      <w:numFmt w:val="bullet"/>
+      <w:lvlText w:val=""/>
+      <w:lvlJc w:val="left"/>
+      <w:pPr>
+        <w:tabs>
+          <w:tab w:val="num" w:pos="5040"/>
+        </w:tabs>
+        <w:ind w:left="5040" w:hanging="360"/>
+      </w:pPr>
+      <w:rPr>
+        <w:rFonts w:ascii="Wingdings" w:hAnsi="Wingdings" w:hint="default"/>
+        <w:sz w:val="20"/>
+      </w:rPr>
+    </w:lvl>
+    <w:lvl w:ilvl="7" w:tentative="1">
+      <w:start w:val="1"/>
+      <w:numFmt w:val="bullet"/>
+      <w:lvlText w:val=""/>
+      <w:lvlJc w:val="left"/>
+      <w:pPr>
+        <w:tabs>
+          <w:tab w:val="num" w:pos="5760"/>
+        </w:tabs>
+        <w:ind w:left="5760" w:hanging="360"/>
+      </w:pPr>
+      <w:rPr>
+        <w:rFonts w:ascii="Wingdings" w:hAnsi="Wingdings" w:hint="default"/>
+        <w:sz w:val="20"/>
+      </w:rPr>
+    </w:lvl>
+    <w:lvl w:ilvl="8" w:tentative="1">
+      <w:start w:val="1"/>
+      <w:numFmt w:val="bullet"/>
+      <w:lvlText w:val=""/>
+      <w:lvlJc w:val="left"/>
+      <w:pPr>
+        <w:tabs>
+          <w:tab w:val="num" w:pos="6480"/>
+        </w:tabs>
+        <w:ind w:left="6480" w:hanging="360"/>
+      </w:pPr>
+      <w:rPr>
+        <w:rFonts w:ascii="Wingdings" w:hAnsi="Wingdings" w:hint="default"/>
+        <w:sz w:val="20"/>
+      </w:rPr>
+    </w:lvl>
+  </w:abstractNum>
+  <w:num w:numId="1" w16cid:durableId="2048139089">
+    <w:abstractNumId w:val="3"/>
+  </w:num>
+  <w:num w:numId="2" w16cid:durableId="366102231">
+    <w:abstractNumId w:val="0"/>
+  </w:num>
+  <w:num w:numId="3" w16cid:durableId="1383334703">
+    <w:abstractNumId w:val="5"/>
+  </w:num>
+  <w:num w:numId="4" w16cid:durableId="2103409302">
+    <w:abstractNumId w:val="4"/>
+  </w:num>
+  <w:num w:numId="5" w16cid:durableId="1364594946">
+    <w:abstractNumId w:val="1"/>
+  </w:num>
+  <w:num w:numId="6" w16cid:durableId="1149206406">
+    <w:abstractNumId w:val="2"/>
+  </w:num>
+</w:numbering>
 </file>
 
 <file path=word/styles.xml><?xml version="1.0" encoding="utf-8"?>
@@ -1085,6 +2382,29 @@
       <w:spacing w:val="5"/>
     </w:rPr>
   </w:style>
+  <w:style w:type="character" w:styleId="Hyperlink">
+    <w:name w:val="Hyperlink"/>
+    <w:basedOn w:val="DefaultParagraphFont"/>
+    <w:uiPriority w:val="99"/>
+    <w:unhideWhenUsed/>
+    <w:rsid w:val="008A69C7"/>
+    <w:rPr>
+      <w:color w:val="0563C1" w:themeColor="hyperlink"/>
+      <w:u w:val="single"/>
+    </w:rPr>
+  </w:style>
+  <w:style w:type="character" w:styleId="UnresolvedMention">
+    <w:name w:val="Unresolved Mention"/>
+    <w:basedOn w:val="DefaultParagraphFont"/>
+    <w:uiPriority w:val="99"/>
+    <w:semiHidden/>
+    <w:unhideWhenUsed/>
+    <w:rsid w:val="008A69C7"/>
+    <w:rPr>
+      <w:color w:val="605E5C"/>
+      <w:shd w:val="clear" w:color="auto" w:fill="E1DFDD"/>
+    </w:rPr>
+  </w:style>
 </w:styles>
 </file>
 

</xml_diff>